<commit_message>
v1.4.0: Edge for Business design and configuration
</commit_message>
<xml_diff>
--- a/static/content/files/Blueprint Essential Eight Template.docx
+++ b/static/content/files/Blueprint Essential Eight Template.docx
@@ -20681,6 +20681,63 @@
         <w:t xml:space="preserve">Web browsers</w:t>
       </w:r>
     </w:p>
+    <w:tbl>
+      <w:tblPr>
+        <w:tblStyle w:val="Info"/>
+        <w:tblW w:type="pct" w:w="5000"/>
+        <w:tblLayout w:type="fixed"/>
+        <w:tblLook w:firstRow="1" w:lastRow="0" w:firstColumn="0" w:lastColumn="0" w:noHBand="0" w:noVBand="0" w:val="0020"/>
+      </w:tblPr>
+      <w:tblGrid>
+        <w:gridCol w:w="7920"/>
+      </w:tblGrid>
+      <w:tr>
+        <w:trPr>
+          <w:tblHeader w:val="on"/>
+        </w:trPr>
+        <w:tc>
+          <w:tcPr/>
+          <w:p>
+            <w:pPr>
+              <w:pStyle w:val="Compact"/>
+            </w:pPr>
+            <w:r>
+              <w:t xml:space="preserve">EOT</w:t>
+            </w:r>
+          </w:p>
+        </w:tc>
+      </w:tr>
+      <w:tr>
+        <w:tc>
+          <w:tcPr/>
+          <w:p>
+            <w:pPr>
+              <w:pStyle w:val="Compact"/>
+            </w:pPr>
+            <w:r>
+              <w:rPr>
+                <w:b/>
+                <w:bCs/>
+              </w:rPr>
+              <w:t xml:space="preserve">Blueprint guidance</w:t>
+            </w:r>
+          </w:p>
+        </w:tc>
+      </w:tr>
+      <w:tr>
+        <w:tc>
+          <w:tcPr/>
+          <w:p>
+            <w:pPr>
+              <w:pStyle w:val="BodyText"/>
+            </w:pPr>
+            <w:r>
+              <w:t xml:space="preserve">The Blueprint provides guidance for configuring Microsoft Edge. It also discourages installing secondary browsers as they can unnecessarily increase the attack surface while complicating the consistent enforcement of security policies and patch management.</w:t>
+            </w:r>
+          </w:p>
+        </w:tc>
+      </w:tr>
+    </w:tbl>
     <w:p>
       <w:pPr>
         <w:pStyle w:val="BodyText"/>
@@ -20856,7 +20913,7 @@
                     <w:rPr>
                       <w:rStyle w:val="VerbatimChar"/>
                     </w:rPr>
-                    <w:t xml:space="preserve">Yes - RESTRICTED VIA WDAC USING BUILT IN EDGE FUNCTIONALITY, AND BLOCKED VIA &lt;ORGANISATION-NAME&gt; &lt;GATEWAY-SYSTEM&gt;</w:t>
+                    <w:t xml:space="preserve">YES - THIRD-PARTY WEB ADVERTISEMENT BLOCKING IS ENFORCED IN MICROSOFT EDGE VIA WDAC-CONTROLLED EXTENSIONS AND SUPPLEMENTED BY &lt;ORGANISATION-NAME&gt; &lt;GATEWAY-SYSTEM&gt;</w:t>
                   </w:r>
                 </w:p>
               </w:tc>
@@ -21969,7 +22026,7 @@
                     <w:rPr>
                       <w:rStyle w:val="VerbatimChar"/>
                     </w:rPr>
-                    <w:t xml:space="preserve">Yes - RESTRICTED VIA WDAC USING BUILT IN EDGE FUNCTIONALITY, AND BLOCKED VIA &lt;ORGANISATION-NAME&gt; &lt;GATEWAY-SYSTEM&gt;</w:t>
+                    <w:t xml:space="preserve">YES - THIRD-PARTY WEB ADVERTISEMENT BLOCKING IS ENFORCED IN MICROSOFT EDGE VIA WDAC-CONTROLLED EXTENSIONS AND SUPPLEMENTED BY &lt;ORGANISATION-NAME&gt; &lt;GATEWAY-SYSTEM&gt;</w:t>
                   </w:r>
                 </w:p>
               </w:tc>

</xml_diff>